<commit_message>
feat(ingest): implement A pipeline with offline validation
</commit_message>
<xml_diff>
--- a/docs/사전기획서.docx
+++ b/docs/사전기획서.docx
@@ -8007,324 +8007,356 @@
               <w:rPr>
                 <w:rtl w:val="0"/>
               </w:rPr>
-            </w:r>
-          </w:p>
-        </w:tc>
-        <w:tc>
-          <w:tcPr>
-            <w:tcMar>
-              <w:top w:w="100.0" w:type="dxa"/>
-              <w:bottom w:w="100.0" w:type="dxa"/>
-            </w:tcMar>
-            <w:vAlign w:val="center"/>
-          </w:tcPr>
-          <w:p>
-            <w:pPr>
-              <w:spacing w:after="0" w:before="0" w:lineRule="auto"/>
-              <w:rPr/>
-            </w:pPr>
-            <w:r>
-              <w:rPr>
-                <w:rtl w:val="0"/>
-              </w:rPr>
-            </w:r>
-          </w:p>
-        </w:tc>
-        <w:tc>
-          <w:tcPr>
-            <w:tcMar>
-              <w:top w:w="100.0" w:type="dxa"/>
-              <w:bottom w:w="100.0" w:type="dxa"/>
-            </w:tcMar>
-            <w:vAlign w:val="center"/>
-          </w:tcPr>
-          <w:p>
-            <w:pPr>
-              <w:spacing w:after="0" w:before="0" w:lineRule="auto"/>
-              <w:rPr/>
-            </w:pPr>
-            <w:r>
-              <w:rPr>
-                <w:rtl w:val="0"/>
-              </w:rPr>
-            </w:r>
-          </w:p>
-        </w:tc>
-        <w:tc>
-          <w:tcPr>
-            <w:tcMar>
-              <w:top w:w="100.0" w:type="dxa"/>
-              <w:bottom w:w="100.0" w:type="dxa"/>
-            </w:tcMar>
-            <w:vAlign w:val="center"/>
-          </w:tcPr>
-          <w:p>
-            <w:pPr>
-              <w:spacing w:after="0" w:before="0" w:lineRule="auto"/>
-              <w:rPr/>
-            </w:pPr>
-            <w:r>
-              <w:rPr>
-                <w:rtl w:val="0"/>
-              </w:rPr>
-            </w:r>
-          </w:p>
-        </w:tc>
-      </w:tr>
-      <w:tr>
-        <w:trPr>
-          <w:cantSplit w:val="0"/>
-          <w:tblHeader w:val="0"/>
-        </w:trPr>
-        <w:tc>
-          <w:tcPr>
-            <w:tcMar>
-              <w:top w:w="100.0" w:type="dxa"/>
-              <w:bottom w:w="100.0" w:type="dxa"/>
-            </w:tcMar>
-            <w:vAlign w:val="center"/>
-          </w:tcPr>
-          <w:p>
-            <w:pPr>
-              <w:spacing w:after="0" w:before="0" w:lineRule="auto"/>
-              <w:rPr/>
-            </w:pPr>
-            <w:r>
-              <w:rPr>
-                <w:rtl w:val="0"/>
-              </w:rPr>
-            </w:r>
-          </w:p>
-        </w:tc>
-        <w:tc>
-          <w:tcPr>
-            <w:tcMar>
-              <w:top w:w="100.0" w:type="dxa"/>
-              <w:bottom w:w="100.0" w:type="dxa"/>
-            </w:tcMar>
-            <w:vAlign w:val="center"/>
-          </w:tcPr>
-          <w:p>
-            <w:pPr>
-              <w:spacing w:after="0" w:before="0" w:lineRule="auto"/>
-              <w:rPr/>
-            </w:pPr>
-            <w:r>
-              <w:rPr>
-                <w:rtl w:val="0"/>
-              </w:rPr>
-            </w:r>
-          </w:p>
-        </w:tc>
-        <w:tc>
-          <w:tcPr>
-            <w:tcMar>
-              <w:top w:w="100.0" w:type="dxa"/>
-              <w:bottom w:w="100.0" w:type="dxa"/>
-            </w:tcMar>
-            <w:vAlign w:val="center"/>
-          </w:tcPr>
-          <w:p>
-            <w:pPr>
-              <w:spacing w:after="0" w:before="0" w:lineRule="auto"/>
-              <w:rPr/>
-            </w:pPr>
-            <w:r>
-              <w:rPr>
-                <w:rtl w:val="0"/>
-              </w:rPr>
-            </w:r>
-          </w:p>
-        </w:tc>
-        <w:tc>
-          <w:tcPr>
-            <w:tcMar>
-              <w:top w:w="100.0" w:type="dxa"/>
-              <w:bottom w:w="100.0" w:type="dxa"/>
-            </w:tcMar>
-            <w:vAlign w:val="center"/>
-          </w:tcPr>
-          <w:p>
-            <w:pPr>
-              <w:spacing w:after="0" w:before="0" w:lineRule="auto"/>
-              <w:rPr/>
-            </w:pPr>
-            <w:r>
-              <w:rPr>
-                <w:rtl w:val="0"/>
-              </w:rPr>
-            </w:r>
-          </w:p>
-        </w:tc>
-      </w:tr>
-      <w:tr>
-        <w:trPr>
-          <w:cantSplit w:val="0"/>
-          <w:tblHeader w:val="0"/>
-        </w:trPr>
-        <w:tc>
-          <w:tcPr>
-            <w:tcMar>
-              <w:top w:w="100.0" w:type="dxa"/>
-              <w:bottom w:w="100.0" w:type="dxa"/>
-            </w:tcMar>
-            <w:vAlign w:val="center"/>
-          </w:tcPr>
-          <w:p>
-            <w:pPr>
-              <w:spacing w:after="0" w:before="0" w:lineRule="auto"/>
-              <w:rPr/>
-            </w:pPr>
-            <w:r>
-              <w:rPr>
-                <w:rtl w:val="0"/>
-              </w:rPr>
-            </w:r>
-          </w:p>
-        </w:tc>
-        <w:tc>
-          <w:tcPr>
-            <w:tcMar>
-              <w:top w:w="100.0" w:type="dxa"/>
-              <w:bottom w:w="100.0" w:type="dxa"/>
-            </w:tcMar>
-            <w:vAlign w:val="center"/>
-          </w:tcPr>
-          <w:p>
-            <w:pPr>
-              <w:spacing w:after="0" w:before="0" w:lineRule="auto"/>
-              <w:rPr/>
-            </w:pPr>
-            <w:r>
-              <w:rPr>
-                <w:rtl w:val="0"/>
-              </w:rPr>
-            </w:r>
-          </w:p>
-        </w:tc>
-        <w:tc>
-          <w:tcPr>
-            <w:tcMar>
-              <w:top w:w="100.0" w:type="dxa"/>
-              <w:bottom w:w="100.0" w:type="dxa"/>
-            </w:tcMar>
-            <w:vAlign w:val="center"/>
-          </w:tcPr>
-          <w:p>
-            <w:pPr>
-              <w:spacing w:after="0" w:before="0" w:lineRule="auto"/>
-              <w:rPr/>
-            </w:pPr>
-            <w:r>
-              <w:rPr>
-                <w:rtl w:val="0"/>
-              </w:rPr>
-            </w:r>
-          </w:p>
-        </w:tc>
-        <w:tc>
-          <w:tcPr>
-            <w:tcMar>
-              <w:top w:w="100.0" w:type="dxa"/>
-              <w:bottom w:w="100.0" w:type="dxa"/>
-            </w:tcMar>
-            <w:vAlign w:val="center"/>
-          </w:tcPr>
-          <w:p>
-            <w:pPr>
-              <w:spacing w:after="0" w:before="0" w:lineRule="auto"/>
-              <w:rPr/>
-            </w:pPr>
-            <w:r>
-              <w:rPr>
-                <w:rtl w:val="0"/>
-              </w:rPr>
-            </w:r>
-          </w:p>
-        </w:tc>
-      </w:tr>
-      <w:tr>
-        <w:trPr>
-          <w:cantSplit w:val="0"/>
-          <w:tblHeader w:val="0"/>
-        </w:trPr>
-        <w:tc>
-          <w:tcPr>
-            <w:tcMar>
-              <w:top w:w="100.0" w:type="dxa"/>
-              <w:bottom w:w="100.0" w:type="dxa"/>
-            </w:tcMar>
-            <w:vAlign w:val="center"/>
-          </w:tcPr>
-          <w:p>
-            <w:pPr>
-              <w:spacing w:after="0" w:before="0" w:lineRule="auto"/>
-              <w:rPr/>
-            </w:pPr>
-            <w:r>
-              <w:rPr>
-                <w:rtl w:val="0"/>
-              </w:rPr>
-            </w:r>
-          </w:p>
-        </w:tc>
-        <w:tc>
-          <w:tcPr>
-            <w:tcMar>
-              <w:top w:w="100.0" w:type="dxa"/>
-              <w:bottom w:w="100.0" w:type="dxa"/>
-            </w:tcMar>
-            <w:vAlign w:val="center"/>
-          </w:tcPr>
-          <w:p>
-            <w:pPr>
-              <w:spacing w:after="0" w:before="0" w:lineRule="auto"/>
-              <w:rPr/>
-            </w:pPr>
-            <w:r>
-              <w:rPr>
-                <w:rtl w:val="0"/>
-              </w:rPr>
-            </w:r>
-          </w:p>
-        </w:tc>
-        <w:tc>
-          <w:tcPr>
-            <w:tcMar>
-              <w:top w:w="100.0" w:type="dxa"/>
-              <w:bottom w:w="100.0" w:type="dxa"/>
-            </w:tcMar>
-            <w:vAlign w:val="center"/>
-          </w:tcPr>
-          <w:p>
-            <w:pPr>
-              <w:spacing w:after="0" w:before="0" w:lineRule="auto"/>
-              <w:rPr/>
-            </w:pPr>
-            <w:r>
-              <w:rPr>
-                <w:rtl w:val="0"/>
-              </w:rPr>
-            </w:r>
-          </w:p>
-        </w:tc>
-        <w:tc>
-          <w:tcPr>
-            <w:tcMar>
-              <w:top w:w="100.0" w:type="dxa"/>
-              <w:bottom w:w="100.0" w:type="dxa"/>
-            </w:tcMar>
-            <w:vAlign w:val="center"/>
-          </w:tcPr>
-          <w:p>
-            <w:pPr>
-              <w:spacing w:after="0" w:before="0" w:lineRule="auto"/>
-              <w:rPr/>
-            </w:pPr>
-            <w:r>
-              <w:rPr>
-                <w:rtl w:val="0"/>
-              </w:rPr>
+              <w:t>A 수집 완전성 (2026-10-19)</w:t>
+            </w:r>
+          </w:p>
+        </w:tc>
+        <w:tc>
+          <w:tcPr>
+            <w:tcMar>
+              <w:top w:w="100.0" w:type="dxa"/>
+              <w:bottom w:w="100.0" w:type="dxa"/>
+            </w:tcMar>
+            <w:vAlign w:val="center"/>
+          </w:tcPr>
+          <w:p>
+            <w:pPr>
+              <w:spacing w:after="0" w:before="0" w:lineRule="auto"/>
+              <w:rPr/>
+            </w:pPr>
+            <w:r>
+              <w:rPr>
+                <w:rtl w:val="0"/>
+              </w:rPr>
+              <w:t>부분·표본 수집의 오판 위험</w:t>
+            </w:r>
+          </w:p>
+        </w:tc>
+        <w:tc>
+          <w:tcPr>
+            <w:tcMar>
+              <w:top w:w="100.0" w:type="dxa"/>
+              <w:bottom w:w="100.0" w:type="dxa"/>
+            </w:tcMar>
+            <w:vAlign w:val="center"/>
+          </w:tcPr>
+          <w:p>
+            <w:pPr>
+              <w:spacing w:after="0" w:before="0" w:lineRule="auto"/>
+              <w:rPr/>
+            </w:pPr>
+            <w:r>
+              <w:rPr>
+                <w:rtl w:val="0"/>
+              </w:rPr>
+              <w:t>실행별 원본·완전성 기록, 검증된 전체 목록만 소실 허가</w:t>
+            </w:r>
+          </w:p>
+        </w:tc>
+        <w:tc>
+          <w:tcPr>
+            <w:tcMar>
+              <w:top w:w="100.0" w:type="dxa"/>
+              <w:bottom w:w="100.0" w:type="dxa"/>
+            </w:tcMar>
+            <w:vAlign w:val="center"/>
+          </w:tcPr>
+          <w:p>
+            <w:pPr>
+              <w:spacing w:after="0" w:before="0" w:lineRule="auto"/>
+              <w:rPr/>
+            </w:pPr>
+            <w:r>
+              <w:rPr>
+                <w:rtl w:val="0"/>
+              </w:rPr>
+              <w:t>오프라인 확인.</w:t>
+              <w:br/>
+              <w:t>API 미검증으로</w:t>
+              <w:br/>
+              <w:t>소실 판단 차단</w:t>
+            </w:r>
+          </w:p>
+        </w:tc>
+      </w:tr>
+      <w:tr>
+        <w:trPr>
+          <w:cantSplit w:val="0"/>
+          <w:tblHeader w:val="0"/>
+        </w:trPr>
+        <w:tc>
+          <w:tcPr>
+            <w:tcMar>
+              <w:top w:w="100.0" w:type="dxa"/>
+              <w:bottom w:w="100.0" w:type="dxa"/>
+            </w:tcMar>
+            <w:vAlign w:val="center"/>
+          </w:tcPr>
+          <w:p>
+            <w:pPr>
+              <w:spacing w:after="0" w:before="0" w:lineRule="auto"/>
+              <w:rPr/>
+            </w:pPr>
+            <w:r>
+              <w:rPr>
+                <w:rtl w:val="0"/>
+              </w:rPr>
+              <w:t>SQLite 증분·인계</w:t>
+            </w:r>
+          </w:p>
+        </w:tc>
+        <w:tc>
+          <w:tcPr>
+            <w:tcMar>
+              <w:top w:w="100.0" w:type="dxa"/>
+              <w:bottom w:w="100.0" w:type="dxa"/>
+            </w:tcMar>
+            <w:vAlign w:val="center"/>
+          </w:tcPr>
+          <w:p>
+            <w:pPr>
+              <w:spacing w:after="0" w:before="0" w:lineRule="auto"/>
+              <w:rPr/>
+            </w:pPr>
+            <w:r>
+              <w:rPr>
+                <w:rtl w:val="0"/>
+              </w:rPr>
+              <w:t>중단·소비 실패·청크 수 감소</w:t>
+            </w:r>
+          </w:p>
+        </w:tc>
+        <w:tc>
+          <w:tcPr>
+            <w:tcMar>
+              <w:top w:w="100.0" w:type="dxa"/>
+              <w:bottom w:w="100.0" w:type="dxa"/>
+            </w:tcMar>
+            <w:vAlign w:val="center"/>
+          </w:tcPr>
+          <w:p>
+            <w:pPr>
+              <w:spacing w:after="0" w:before="0" w:lineRule="auto"/>
+              <w:rPr/>
+            </w:pPr>
+            <w:r>
+              <w:rPr>
+                <w:rtl w:val="0"/>
+              </w:rPr>
+              <w:t>DB·pending 원자 기록, 서비스 전체 교체와 버전별 확인</w:t>
+            </w:r>
+          </w:p>
+        </w:tc>
+        <w:tc>
+          <w:tcPr>
+            <w:tcMar>
+              <w:top w:w="100.0" w:type="dxa"/>
+              <w:bottom w:w="100.0" w:type="dxa"/>
+            </w:tcMar>
+            <w:vAlign w:val="center"/>
+          </w:tcPr>
+          <w:p>
+            <w:pPr>
+              <w:spacing w:after="0" w:before="0" w:lineRule="auto"/>
+              <w:rPr/>
+            </w:pPr>
+            <w:r>
+              <w:rPr>
+                <w:rtl w:val="0"/>
+              </w:rPr>
+              <w:t>가짜 소비자 확인.</w:t>
+              <w:br/>
+              <w:t>실제 B 연동은</w:t>
+              <w:br/>
+              <w:t>합의·구현 대기</w:t>
+            </w:r>
+          </w:p>
+        </w:tc>
+      </w:tr>
+      <w:tr>
+        <w:trPr>
+          <w:cantSplit w:val="0"/>
+          <w:tblHeader w:val="0"/>
+        </w:trPr>
+        <w:tc>
+          <w:tcPr>
+            <w:tcMar>
+              <w:top w:w="100.0" w:type="dxa"/>
+              <w:bottom w:w="100.0" w:type="dxa"/>
+            </w:tcMar>
+            <w:vAlign w:val="center"/>
+          </w:tcPr>
+          <w:p>
+            <w:pPr>
+              <w:spacing w:after="0" w:before="0" w:lineRule="auto"/>
+              <w:rPr/>
+            </w:pPr>
+            <w:r>
+              <w:rPr>
+                <w:rtl w:val="0"/>
+              </w:rPr>
+              <w:t>정제·구조 분할</w:t>
+            </w:r>
+          </w:p>
+        </w:tc>
+        <w:tc>
+          <w:tcPr>
+            <w:tcMar>
+              <w:top w:w="100.0" w:type="dxa"/>
+              <w:bottom w:w="100.0" w:type="dxa"/>
+            </w:tcMar>
+            <w:vAlign w:val="center"/>
+          </w:tcPr>
+          <w:p>
+            <w:pPr>
+              <w:spacing w:after="0" w:before="0" w:lineRule="auto"/>
+              <w:rPr/>
+            </w:pPr>
+            <w:r>
+              <w:rPr>
+                <w:rtl w:val="0"/>
+              </w:rPr>
+              <w:t>복합 자격·원천 누락·경계 유실</w:t>
+            </w:r>
+          </w:p>
+        </w:tc>
+        <w:tc>
+          <w:tcPr>
+            <w:tcMar>
+              <w:top w:w="100.0" w:type="dxa"/>
+              <w:bottom w:w="100.0" w:type="dxa"/>
+            </w:tcMar>
+            <w:vAlign w:val="center"/>
+          </w:tcPr>
+          <w:p>
+            <w:pPr>
+              <w:spacing w:after="0" w:before="0" w:lineRule="auto"/>
+              <w:rPr/>
+            </w:pPr>
+            <w:r>
+              <w:rPr>
+                <w:rtl w:val="0"/>
+              </w:rPr>
+              <w:t>4개 항목·서비스명 접두, 본문 보존, 실패 상세 유지, 미상 키 생략</w:t>
+            </w:r>
+          </w:p>
+        </w:tc>
+        <w:tc>
+          <w:tcPr>
+            <w:tcMar>
+              <w:top w:w="100.0" w:type="dxa"/>
+              <w:bottom w:w="100.0" w:type="dxa"/>
+            </w:tcMar>
+            <w:vAlign w:val="center"/>
+          </w:tcPr>
+          <w:p>
+            <w:pPr>
+              <w:spacing w:after="0" w:before="0" w:lineRule="auto"/>
+              <w:rPr/>
+            </w:pPr>
+            <w:r>
+              <w:rPr>
+                <w:rtl w:val="0"/>
+              </w:rPr>
+              <w:t>JA 코드 미검증.</w:t>
+              <w:br/>
+              <w:t>기관·나이·지역</w:t>
+              <w:br/>
+              <w:t>추정 금지</w:t>
+            </w:r>
+          </w:p>
+        </w:tc>
+      </w:tr>
+      <w:tr>
+        <w:trPr>
+          <w:cantSplit w:val="0"/>
+          <w:tblHeader w:val="0"/>
+        </w:trPr>
+        <w:tc>
+          <w:tcPr>
+            <w:tcMar>
+              <w:top w:w="100.0" w:type="dxa"/>
+              <w:bottom w:w="100.0" w:type="dxa"/>
+            </w:tcMar>
+            <w:vAlign w:val="center"/>
+          </w:tcPr>
+          <w:p>
+            <w:pPr>
+              <w:spacing w:after="0" w:before="0" w:lineRule="auto"/>
+              <w:rPr/>
+            </w:pPr>
+            <w:r>
+              <w:rPr>
+                <w:rtl w:val="0"/>
+              </w:rPr>
+              <w:t>청년 수집 정책 (잠정)</w:t>
+            </w:r>
+          </w:p>
+        </w:tc>
+        <w:tc>
+          <w:tcPr>
+            <w:tcMar>
+              <w:top w:w="100.0" w:type="dxa"/>
+              <w:bottom w:w="100.0" w:type="dxa"/>
+            </w:tcMar>
+            <w:vAlign w:val="center"/>
+          </w:tcPr>
+          <w:p>
+            <w:pPr>
+              <w:spacing w:after="0" w:before="0" w:lineRule="auto"/>
+              <w:rPr/>
+            </w:pPr>
+            <w:r>
+              <w:rPr>
+                <w:rtl w:val="0"/>
+              </w:rPr>
+              <w:t>성인·구직 일반 사업도 포함 가능</w:t>
+            </w:r>
+          </w:p>
+        </w:tc>
+        <w:tc>
+          <w:tcPr>
+            <w:tcMar>
+              <w:top w:w="100.0" w:type="dxa"/>
+              <w:bottom w:w="100.0" w:type="dxa"/>
+            </w:tcMar>
+            <w:vAlign w:val="center"/>
+          </w:tcPr>
+          <w:p>
+            <w:pPr>
+              <w:spacing w:after="0" w:before="0" w:lineRule="auto"/>
+              <w:rPr/>
+            </w:pPr>
+            <w:r>
+              <w:rPr>
+                <w:rtl w:val="0"/>
+              </w:rPr>
+              <w:t>설정 연령 겹침 OR 지정 필드 키워드, 판정 이유 보존</w:t>
+            </w:r>
+          </w:p>
+        </w:tc>
+        <w:tc>
+          <w:tcPr>
+            <w:tcMar>
+              <w:top w:w="100.0" w:type="dxa"/>
+              <w:bottom w:w="100.0" w:type="dxa"/>
+            </w:tcMar>
+            <w:vAlign w:val="center"/>
+          </w:tcPr>
+          <w:p>
+            <w:pPr>
+              <w:spacing w:after="0" w:before="0" w:lineRule="auto"/>
+              <w:rPr/>
+            </w:pPr>
+            <w:r>
+              <w:rPr>
+                <w:rtl w:val="0"/>
+              </w:rPr>
+              <w:t>팀 합의 대기.</w:t>
+              <w:br/>
+              <w:t>수집 연령을</w:t>
+              <w:br/>
+              <w:t>자격에 채우지 않음</w:t>
             </w:r>
           </w:p>
         </w:tc>

</xml_diff>

<commit_message>
fix(ingest): refine field merging and isolate validation storage
</commit_message>
<xml_diff>
--- a/docs/사전기획서.docx
+++ b/docs/사전기획서.docx
@@ -8357,6 +8357,294 @@
               <w:t>수집 연령을</w:t>
               <w:br/>
               <w:t>자격에 채우지 않음</w:t>
+            </w:r>
+          </w:p>
+        </w:tc>
+      </w:tr>
+      <w:tr>
+        <w:trPr>
+          <w:cantSplit w:val="0"/>
+          <w:tblHeader w:val="0"/>
+        </w:trPr>
+        <w:tc>
+          <w:tcPr>
+            <w:tcMar>
+              <w:top w:w="100.0" w:type="dxa"/>
+              <w:bottom w:w="100.0" w:type="dxa"/>
+            </w:tcMar>
+            <w:vAlign w:val="center"/>
+          </w:tcPr>
+          <w:p>
+            <w:pPr>
+              <w:spacing w:after="0" w:before="0" w:lineRule="auto"/>
+              <w:rPr/>
+            </w:pPr>
+            <w:r>
+              <w:rPr>
+                <w:rtl w:val="0"/>
+              </w:rPr>
+              <w:t>현재 관측·fallback</w:t>
+              <w:br/>
+              <w:t>분리 (2차)</w:t>
+            </w:r>
+          </w:p>
+        </w:tc>
+        <w:tc>
+          <w:tcPr>
+            <w:tcMar>
+              <w:top w:w="100.0" w:type="dxa"/>
+              <w:bottom w:w="100.0" w:type="dxa"/>
+            </w:tcMar>
+            <w:vAlign w:val="center"/>
+          </w:tcPr>
+          <w:p>
+            <w:pPr>
+              <w:spacing w:after="0" w:before="0" w:lineRule="auto"/>
+              <w:rPr/>
+            </w:pPr>
+            <w:r>
+              <w:rPr>
+                <w:rtl w:val="0"/>
+              </w:rPr>
+              <w:t>과거 상세가 연장 기한·이름·기관을 덮는 문제</w:t>
+            </w:r>
+          </w:p>
+        </w:tc>
+        <w:tc>
+          <w:tcPr>
+            <w:tcMar>
+              <w:top w:w="100.0" w:type="dxa"/>
+              <w:bottom w:w="100.0" w:type="dxa"/>
+            </w:tcMar>
+            <w:vAlign w:val="center"/>
+          </w:tcPr>
+          <w:p>
+            <w:pPr>
+              <w:spacing w:after="0" w:before="0" w:lineRule="auto"/>
+              <w:rPr/>
+            </w:pPr>
+            <w:r>
+              <w:rPr>
+                <w:rtl w:val="0"/>
+              </w:rPr>
+              <w:t>필드별 출처·충돌 감사, 정상 빈값·누락·실패 구분</w:t>
+            </w:r>
+          </w:p>
+        </w:tc>
+        <w:tc>
+          <w:tcPr>
+            <w:tcMar>
+              <w:top w:w="100.0" w:type="dxa"/>
+              <w:bottom w:w="100.0" w:type="dxa"/>
+            </w:tcMar>
+            <w:vAlign w:val="center"/>
+          </w:tcPr>
+          <w:p>
+            <w:pPr>
+              <w:spacing w:after="0" w:before="0" w:lineRule="auto"/>
+              <w:rPr/>
+            </w:pPr>
+            <w:r>
+              <w:rPr>
+                <w:rtl w:val="0"/>
+              </w:rPr>
+              <w:t>회귀 검증.</w:t>
+              <w:br/>
+              <w:t>최신성 순서는</w:t>
+              <w:br/>
+              <w:t>잠정 규칙</w:t>
+            </w:r>
+          </w:p>
+        </w:tc>
+      </w:tr>
+      <w:tr>
+        <w:trPr>
+          <w:cantSplit w:val="0"/>
+          <w:tblHeader w:val="0"/>
+        </w:trPr>
+        <w:tc>
+          <w:tcPr>
+            <w:tcMar>
+              <w:top w:w="100.0" w:type="dxa"/>
+              <w:bottom w:w="100.0" w:type="dxa"/>
+            </w:tcMar>
+            <w:vAlign w:val="center"/>
+          </w:tcPr>
+          <w:p>
+            <w:pPr>
+              <w:spacing w:after="0" w:before="0" w:lineRule="auto"/>
+              <w:rPr/>
+            </w:pPr>
+            <w:r>
+              <w:rPr>
+                <w:rtl w:val="0"/>
+              </w:rPr>
+              <w:t>fixture·live 격리</w:t>
+              <w:br/>
+              <w:t>(2차)</w:t>
+            </w:r>
+          </w:p>
+        </w:tc>
+        <w:tc>
+          <w:tcPr>
+            <w:tcMar>
+              <w:top w:w="100.0" w:type="dxa"/>
+              <w:bottom w:w="100.0" w:type="dxa"/>
+            </w:tcMar>
+            <w:vAlign w:val="center"/>
+          </w:tcPr>
+          <w:p>
+            <w:pPr>
+              <w:spacing w:after="0" w:before="0" w:lineRule="auto"/>
+              <w:rPr/>
+            </w:pPr>
+            <w:r>
+              <w:rPr>
+                <w:rtl w:val="0"/>
+              </w:rPr>
+              <w:t>합성 데이터가 운영 DB와 원본 경로에 기록</w:t>
+            </w:r>
+          </w:p>
+        </w:tc>
+        <w:tc>
+          <w:tcPr>
+            <w:tcMar>
+              <w:top w:w="100.0" w:type="dxa"/>
+              <w:bottom w:w="100.0" w:type="dxa"/>
+            </w:tcMar>
+            <w:vAlign w:val="center"/>
+          </w:tcPr>
+          <w:p>
+            <w:pPr>
+              <w:spacing w:after="0" w:before="0" w:lineRule="auto"/>
+              <w:rPr/>
+            </w:pPr>
+            <w:r>
+              <w:rPr>
+                <w:rtl w:val="0"/>
+              </w:rPr>
+              <w:t>명시적 실행 경로, 운영 별칭·sidecar·잠금 경로 거부</w:t>
+            </w:r>
+          </w:p>
+        </w:tc>
+        <w:tc>
+          <w:tcPr>
+            <w:tcMar>
+              <w:top w:w="100.0" w:type="dxa"/>
+              <w:bottom w:w="100.0" w:type="dxa"/>
+            </w:tcMar>
+            <w:vAlign w:val="center"/>
+          </w:tcPr>
+          <w:p>
+            <w:pPr>
+              <w:spacing w:after="0" w:before="0" w:lineRule="auto"/>
+              <w:rPr/>
+            </w:pPr>
+            <w:r>
+              <w:rPr>
+                <w:rtl w:val="0"/>
+              </w:rPr>
+              <w:t>격리 live 표본</w:t>
+              <w:br/>
+              <w:t>3건씩 확인.</w:t>
+              <w:br/>
+              <w:t>전체 수집 아님</w:t>
+            </w:r>
+          </w:p>
+        </w:tc>
+      </w:tr>
+      <w:tr>
+        <w:trPr>
+          <w:cantSplit w:val="0"/>
+          <w:tblHeader w:val="0"/>
+        </w:trPr>
+        <w:tc>
+          <w:tcPr>
+            <w:tcMar>
+              <w:top w:w="100.0" w:type="dxa"/>
+              <w:bottom w:w="100.0" w:type="dxa"/>
+            </w:tcMar>
+            <w:vAlign w:val="center"/>
+          </w:tcPr>
+          <w:p>
+            <w:pPr>
+              <w:spacing w:after="0" w:before="0" w:lineRule="auto"/>
+              <w:rPr/>
+            </w:pPr>
+            <w:r>
+              <w:rPr>
+                <w:rtl w:val="0"/>
+              </w:rPr>
+              <w:t>HTML 표 정제</w:t>
+              <w:br/>
+              <w:t>(2차)</w:t>
+            </w:r>
+          </w:p>
+        </w:tc>
+        <w:tc>
+          <w:tcPr>
+            <w:tcMar>
+              <w:top w:w="100.0" w:type="dxa"/>
+              <w:bottom w:w="100.0" w:type="dxa"/>
+            </w:tcMar>
+            <w:vAlign w:val="center"/>
+          </w:tcPr>
+          <w:p>
+            <w:pPr>
+              <w:spacing w:after="0" w:before="0" w:lineRule="auto"/>
+              <w:rPr/>
+            </w:pPr>
+            <w:r>
+              <w:rPr>
+                <w:rtl w:val="0"/>
+              </w:rPr>
+              <w:t>19와 34 셀이 1934로 결합</w:t>
+            </w:r>
+          </w:p>
+        </w:tc>
+        <w:tc>
+          <w:tcPr>
+            <w:tcMar>
+              <w:top w:w="100.0" w:type="dxa"/>
+              <w:bottom w:w="100.0" w:type="dxa"/>
+            </w:tcMar>
+            <w:vAlign w:val="center"/>
+          </w:tcPr>
+          <w:p>
+            <w:pPr>
+              <w:spacing w:after="0" w:before="0" w:lineRule="auto"/>
+              <w:rPr/>
+            </w:pPr>
+            <w:r>
+              <w:rPr>
+                <w:rtl w:val="0"/>
+              </w:rPr>
+              <w:t>표준 HTMLParser로 셀·행 경계와 본문 의미 보존</w:t>
+            </w:r>
+          </w:p>
+        </w:tc>
+        <w:tc>
+          <w:tcPr>
+            <w:tcMar>
+              <w:top w:w="100.0" w:type="dxa"/>
+              <w:bottom w:w="100.0" w:type="dxa"/>
+            </w:tcMar>
+            <w:vAlign w:val="center"/>
+          </w:tcPr>
+          <w:p>
+            <w:pPr>
+              <w:spacing w:after="0" w:before="0" w:lineRule="auto"/>
+              <w:rPr/>
+            </w:pPr>
+            <w:r>
+              <w:rPr>
+                <w:rtl w:val="0"/>
+              </w:rPr>
+              <w:t>합성 회귀 확인.</w:t>
+              <w:br/>
+              <w:t>다음 성공 관측 시</w:t>
+              <w:br/>
+              <w:t>한 번 갱신 가능</w:t>
             </w:r>
           </w:p>
         </w:tc>

</xml_diff>

<commit_message>
feat(ingest): verify and acknowledge incremental index handoffs
</commit_message>
<xml_diff>
--- a/docs/사전기획서.docx
+++ b/docs/사전기획서.docx
@@ -8645,6 +8645,96 @@
               <w:t>다음 성공 관측 시</w:t>
               <w:br/>
               <w:t>한 번 갱신 가능</w:t>
+            </w:r>
+          </w:p>
+        </w:tc>
+      </w:tr>
+      <w:tr>
+        <w:trPr>
+          <w:cantSplit w:val="0"/>
+          <w:tblHeader w:val="0"/>
+        </w:trPr>
+        <w:tc>
+          <w:tcPr>
+            <w:tcMar>
+              <w:top w:w="100.0" w:type="dxa"/>
+              <w:bottom w:w="100.0" w:type="dxa"/>
+            </w:tcMar>
+            <w:vAlign w:val="center"/>
+          </w:tcPr>
+          <w:p>
+            <w:pPr>
+              <w:spacing w:after="0" w:before="0" w:lineRule="auto"/>
+              <w:rPr/>
+            </w:pPr>
+            <w:r>
+              <w:rPr>
+                <w:rtl w:val="0"/>
+              </w:rPr>
+              <w:t>증분 색인 인계 소비자 (2026-10-20)</w:t>
+            </w:r>
+          </w:p>
+        </w:tc>
+        <w:tc>
+          <w:tcPr>
+            <w:tcMar>
+              <w:top w:w="100.0" w:type="dxa"/>
+              <w:bottom w:w="100.0" w:type="dxa"/>
+            </w:tcMar>
+            <w:vAlign w:val="center"/>
+          </w:tcPr>
+          <w:p>
+            <w:pPr>
+              <w:spacing w:after="0" w:before="0" w:lineRule="auto"/>
+              <w:rPr/>
+            </w:pPr>
+            <w:r>
+              <w:rPr>
+                <w:rtl w:val="0"/>
+              </w:rPr>
+              <w:t>pending→색인→확인 연결 누락. 부분 실패·병렬 갱신은 오래된 색인과 잔여 조각을 유발.</w:t>
+            </w:r>
+          </w:p>
+        </w:tc>
+        <w:tc>
+          <w:tcPr>
+            <w:tcMar>
+              <w:top w:w="100.0" w:type="dxa"/>
+              <w:bottom w:w="100.0" w:type="dxa"/>
+            </w:tcMar>
+            <w:vAlign w:val="center"/>
+          </w:tcPr>
+          <w:p>
+            <w:pPr>
+              <w:spacing w:after="0" w:before="0" w:lineRule="auto"/>
+              <w:rPr/>
+            </w:pPr>
+            <w:r>
+              <w:rPr>
+                <w:rtl w:val="0"/>
+              </w:rPr>
+              <w:t>저장 이벤트 전체 교체/제거. 색인→DB OS 잠금과 DB/색인/모델 단일 연결. Chroma 원본·파생 BM25 검증 후 정확한 토큰 확인.</w:t>
+            </w:r>
+          </w:p>
+        </w:tc>
+        <w:tc>
+          <w:tcPr>
+            <w:tcMar>
+              <w:top w:w="100.0" w:type="dxa"/>
+              <w:bottom w:w="100.0" w:type="dxa"/>
+            </w:tcMar>
+            <w:vAlign w:val="center"/>
+          </w:tcPr>
+          <w:p>
+            <w:pPr>
+              <w:spacing w:after="0" w:before="0" w:lineRule="auto"/>
+              <w:rPr/>
+            </w:pPr>
+            <w:r>
+              <w:rPr>
+                <w:rtl w:val="0"/>
+              </w:rPr>
+              <w:t>실제 Chroma+가짜 임베딩으로 재처리·잠금·C 전체 근거 조회 검증. 실제 모델·전체 API·검색/답변 품질은 별도 검증.</w:t>
             </w:r>
           </w:p>
         </w:tc>

</xml_diff>

<commit_message>
feat(ingest): expand household scope and replay historical sources safely
</commit_message>
<xml_diff>
--- a/docs/사전기획서.docx
+++ b/docs/사전기획서.docx
@@ -3047,7 +3047,7 @@
               <w:rPr>
                 <w:sz w:val="19"/>
               </w:rPr>
-              <w:t xml:space="preserve">공공데이터포털의 행정안전부 대한민국 공공서비스(혜택) 정보(보조금24) API(serviceList·serviceDetail·supportConditions). 서비스명, 서비스분야, 지원대상, 선정기준, 지원내용, 신청방법, 신청기한, 소관기관, 상세 페이지 링크 등을 사용한다. 1차 범위는 청년 대상 제도로 한정한다(2026-10-20 수집 기준 전체 10,964건 중 848건).</w:t>
+              <w:t xml:space="preserve">공공데이터포털의 행정안전부 대한민국 공공서비스(혜택) 정보(보조금24) API(serviceList·serviceDetail·supportConditions). 서비스명, 서비스분야, 지원대상, 선정기준, 지원내용, 신청방법, 신청기한, 소관기관, 상세 페이지 링크 등을 사용한다. Dataset scope: general personal/household support for young users; personal-household-v1 includes uncertain applicability provisionally. Prior youth-only snapshot (2026-10-20): 848 of 10,964 services.</w:t>
             </w:r>
           </w:p>
         </w:tc>
@@ -4380,7 +4380,7 @@
               <w:rPr>
                 <w:sz w:val="19"/>
               </w:rPr>
-              <w:t xml:space="preserve">[데이터가 바뀔 때] 보조금24 API 증분 수집 → 정제·청년 대상 판정 → SQLite 적재·변경 감지 → 항목별 구조 분할 → 변경 이벤트(pending) 인계 → 임베딩(bge-m3)·벡터 저장소(Chroma)·BM25 색인 반영 및 검증</w:t>
+              <w:t xml:space="preserve">[데이터가 바뀔 때] 보조금24 API 증분 수집 → 정제·개인/가구 포함 판정 → SQLite 적재·변경 감지 → 항목별 구조 분할 → 변경 이벤트(pending) 인계 → 임베딩(bge-m3)·벡터 저장소(Chroma)·BM25 색인 반영 및 검증</w:t>
             </w:r>
           </w:p>
         </w:tc>
@@ -4596,7 +4596,7 @@
               <w:rPr>
                 <w:sz w:val="19"/>
               </w:rPr>
-              <w:t xml:space="preserve">전체 10,964건 수집(2026-10-20). 이 중 청년 대상 848건을 1차 범위로 사용하며, 항목별로 나눈 조각은 2,531개다.</w:t>
+              <w:t xml:space="preserve">Historical 2026-10-20 snapshot: 10,964 listed, youth-only 848 services / 2,531 chunks. The 2026-10-21 policy expands personal/household scope; current expanded production counts require separate authorized reprocessing/indexing.</w:t>
             </w:r>
           </w:p>
         </w:tc>
@@ -8329,6 +8329,103 @@
                 <w:sz w:val="19"/>
               </w:rPr>
               <w:t xml:space="preserve">카드당 확인 필요 항목 5건 → 실제로 확인할 조건(소득·재산 등) 2건 내외 (이전 구현에서 측정, 현재 main 구조에서 재측정 필요)</w:t>
+            </w:r>
+          </w:p>
+        </w:tc>
+      </w:tr>
+      <w:tr>
+        <w:trPr>
+          <w:cantSplit/>
+        </w:trPr>
+        <w:tc>
+          <w:tcPr>
+            <w:tcW w:type="dxa" w:w="2493"/>
+            <w:vAlign w:val="center"/>
+            <w:tcMar>
+              <w:top w:w="100" w:type="dxa"/>
+              <w:start w:w="120" w:type="dxa"/>
+              <w:bottom w:w="100" w:type="dxa"/>
+              <w:end w:w="120" w:type="dxa"/>
+            </w:tcMar>
+          </w:tcPr>
+          <w:p>
+            <w:pPr>
+              <w:spacing w:after="0" w:before="0"/>
+            </w:pPr>
+            <w:r>
+              <w:rPr>
+                <w:sz w:val="19"/>
+              </w:rPr>
+              <w:t>개인·가구 범위 확대 (2026-10-21)</w:t>
+            </w:r>
+          </w:p>
+        </w:tc>
+        <w:tc>
+          <w:tcPr>
+            <w:tcW w:type="dxa" w:w="2493"/>
+            <w:vAlign w:val="center"/>
+            <w:tcMar>
+              <w:top w:w="100" w:type="dxa"/>
+              <w:start w:w="120" w:type="dxa"/>
+              <w:bottom w:w="100" w:type="dxa"/>
+              <w:end w:w="120" w:type="dxa"/>
+            </w:tcMar>
+          </w:tcPr>
+          <w:p>
+            <w:pPr>
+              <w:spacing w:after="0" w:before="0"/>
+            </w:pPr>
+            <w:r>
+              <w:rPr>
+                <w:sz w:val="19"/>
+              </w:rPr>
+              <w:t>청년 키워드만으로 일반 가구·양육 혜택이 제외됨. 제외 레코드에는 본문이 없을 수 있음.</w:t>
+            </w:r>
+          </w:p>
+        </w:tc>
+        <w:tc>
+          <w:tcPr>
+            <w:tcW w:type="dxa" w:w="2493"/>
+            <w:vAlign w:val="center"/>
+            <w:tcMar>
+              <w:top w:w="100" w:type="dxa"/>
+              <w:start w:w="120" w:type="dxa"/>
+              <w:bottom w:w="100" w:type="dxa"/>
+              <w:end w:w="120" w:type="dxa"/>
+            </w:tcMar>
+          </w:tcPr>
+          <w:p>
+            <w:pPr>
+              <w:spacing w:after="0" w:before="0"/>
+            </w:pPr>
+            <w:r>
+              <w:rPr>
+                <w:sz w:val="19"/>
+              </w:rPr>
+              <w:t>personal-household-v1: 개인·가구 포함, 불명확하면 잠정 포함. 기관 전용 명시 근거만 제외. 단일 원본 재처리·과거 관측 유보.</w:t>
+            </w:r>
+          </w:p>
+        </w:tc>
+        <w:tc>
+          <w:tcPr>
+            <w:tcW w:type="dxa" w:w="2493"/>
+            <w:vAlign w:val="center"/>
+            <w:tcMar>
+              <w:top w:w="100" w:type="dxa"/>
+              <w:start w:w="120" w:type="dxa"/>
+              <w:bottom w:w="100" w:type="dxa"/>
+              <w:end w:w="120" w:type="dxa"/>
+            </w:tcMar>
+          </w:tcPr>
+          <w:p>
+            <w:pPr>
+              <w:spacing w:after="0" w:before="0"/>
+            </w:pPr>
+            <w:r>
+              <w:rPr>
+                <w:sz w:val="19"/>
+              </w:rPr>
+              <w:t>자녀 연령·기관 소재지를 신청자 자격으로 추정하지 않음. 전체 교체·정확 토큰 확인 유지. 운영 수집·재색인·라벨 변경은 별도.</w:t>
             </w:r>
           </w:p>
         </w:tc>

</xml_diff>

<commit_message>
feat(ingest): trace regional provenance and resume historical replay
</commit_message>
<xml_diff>
--- a/docs/사전기획서.docx
+++ b/docs/사전기획서.docx
@@ -4644,7 +4644,7 @@
               <w:rPr>
                 <w:sz w:val="19"/>
               </w:rPr>
-              <w:t xml:space="preserve">JSON API 응답. 원본은 실행별로 data/raw/에 저장(커밋 제외)하고, 정제한 서비스는 SQLite(services·ingestion_runs·pending_changes)에 적재한다. 서비스 1건을 지원대상·선정기준·지원내용·신청방법 항목 조각으로 나누고 각 조각 앞에 서비스명을 붙인다(chunk_id = 서비스ID#항목).</w:t>
+              <w:t xml:space="preserve">JSON API 응답. 원본은 실행별로 data/raw/에 저장(커밋 제외)하고, 정제한 서비스는 SQLite(services·ingestion_runs·pending_changes·ingest_state)에 적재한다. 서비스 1건을 지원대상·선정기준·지원내용·신청방법 항목 조각으로 나누고 각 조각 앞에 서비스명을 붙인다(chunk_id = 서비스ID#항목).</w:t>
             </w:r>
           </w:p>
         </w:tc>
@@ -5004,7 +5004,7 @@
               <w:rPr>
                 <w:sz w:val="19"/>
               </w:rPr>
-              <w:t xml:space="preserve">같은 취지의 제도가 중앙부처·지자체별로 반복되어(예: 지역별 청년·출산 지원) 이름과 내용이 거의 같고 지역·금액만 다르다. 검색 결과는 서비스당 조각 1개로 줄여 같은 제도가 Top-K를 채우지 않게 한다. 지역 자격은 지원조건 코드가 검증되지 않았고 소관기관명으로 지역을 추정하지 않기로 해 지역 메타데이터가 비어 있으므로, 지역 필터는 현재 모든 제도를 통과시킨다. 대신 답변 단계에서 근거 원문의 거주지 조건을 사용자 거주지와 비교해 명백히 다를 때만 제외하고, 아니면 "확인 필요"로 표시한다. MMR은 문제가 관찰되면 도입한다.</w:t>
+              <w:t xml:space="preserve">유사한 중앙·지자체 제도는 서비스 단위로 중복을 줄인다. 명시적 거주 문구는 A가 정규화·출처와 함께 보존하고, 없으면 B가 기관명에서 검색용 지역을 추정한다. 미상은 전국으로 채우지 않고 소프트 필터를 통과시킨다. 기관 추정은 신청 자격 검증이 아니다. C 후처리는 명시 근거를 우선하지만 모든 후보가 사라지면 지역을 완화할 수 있으며, 검색에서 이미 차지한 다른 지역 후보의 순위를 복원하지 못한다.</w:t>
             </w:r>
           </w:p>
         </w:tc>
@@ -5986,7 +5986,7 @@
               <w:rPr>
                 <w:sz w:val="19"/>
               </w:rPr>
-              <w:t xml:space="preserve">종료된 제도와 지역·연령이 명백히 맞지 않는 후보를 제거한다. 조건 값이 비어 있으면 제외하지 않고 후보에 남기며(빈 값을 통과 값으로 저장해 Chroma 조건으로 처리), 결과가 없으면 지역→나이 순으로 푼다. 현재 수집 데이터는 지역·나이 값이 비어 있어 실제로 거르는 조건은 신청기한이다.</w:t>
+              <w:t xml:space="preserve">종료된 제도와 지역·연령이 명백히 맞지 않는 후보를 제거한다. 조건 값이 비어 있으면 제외하지 않고 후보에 남기며(빈 값을 통과 값으로 저장해 Chroma 조건으로 처리), 결과가 없으면 지역→나이 순으로 푼다. 지역은 명시 자격/기관 추정/기존 값/미상의 출처를 구분한다. 실제 JA 연령 변환은 보류하며 미상은 자격 제한 없음이 아니다.</w:t>
             </w:r>
           </w:p>
         </w:tc>
@@ -8426,6 +8426,297 @@
                 <w:sz w:val="19"/>
               </w:rPr>
               <w:t>자녀 연령·기관 소재지를 신청자 자격으로 추정하지 않음. 전체 교체·정확 토큰 확인 유지. 운영 수집·재색인·라벨 변경은 별도.</w:t>
+            </w:r>
+          </w:p>
+        </w:tc>
+      </w:tr>
+      <w:tr>
+        <w:trPr>
+          <w:cantSplit/>
+        </w:trPr>
+        <w:tc>
+          <w:tcPr>
+            <w:tcW w:type="dxa" w:w="2493"/>
+            <w:vAlign w:val="center"/>
+            <w:tcMar>
+              <w:top w:w="100" w:type="dxa"/>
+              <w:start w:w="120" w:type="dxa"/>
+              <w:bottom w:w="100" w:type="dxa"/>
+              <w:end w:w="120" w:type="dxa"/>
+            </w:tcMar>
+          </w:tcPr>
+          <w:p>
+            <w:pPr>
+              <w:spacing w:after="0" w:before="0"/>
+            </w:pPr>
+            <w:r>
+              <w:rPr>
+                <w:sz w:val="19"/>
+              </w:rPr>
+              <w:t>지역·출처 경로 (2026-10-22)</w:t>
+            </w:r>
+          </w:p>
+        </w:tc>
+        <w:tc>
+          <w:tcPr>
+            <w:tcW w:type="dxa" w:w="2493"/>
+            <w:vAlign w:val="center"/>
+            <w:tcMar>
+              <w:top w:w="100" w:type="dxa"/>
+              <w:start w:w="120" w:type="dxa"/>
+              <w:bottom w:w="100" w:type="dxa"/>
+              <w:end w:w="120" w:type="dxa"/>
+            </w:tcMar>
+          </w:tcPr>
+          <w:p>
+            <w:pPr>
+              <w:spacing w:after="0" w:before="0"/>
+            </w:pPr>
+            <w:r>
+              <w:rPr>
+                <w:sz w:val="19"/>
+              </w:rPr>
+              <w:t>현재 기관 대체값과 달리 빈 지역인 조각 및 DB/색인 연결 경로 불일치 확인.</w:t>
+            </w:r>
+          </w:p>
+        </w:tc>
+        <w:tc>
+          <w:tcPr>
+            <w:tcW w:type="dxa" w:w="2493"/>
+            <w:vAlign w:val="center"/>
+            <w:tcMar>
+              <w:top w:w="100" w:type="dxa"/>
+              <w:start w:w="120" w:type="dxa"/>
+              <w:bottom w:w="100" w:type="dxa"/>
+              <w:end w:w="120" w:type="dxa"/>
+            </w:tcMar>
+          </w:tcPr>
+          <w:p>
+            <w:pPr>
+              <w:spacing w:after="0" w:before="0"/>
+            </w:pPr>
+            <w:r>
+              <w:rPr>
+                <w:sz w:val="19"/>
+              </w:rPr>
+              <w:t>정규 지역·선택적 출처를 A→B→C에 보존. 명시 거주 문구만 추출, 기관 추정과 구별. 선택 ID만 검증 교체.</w:t>
+            </w:r>
+          </w:p>
+        </w:tc>
+        <w:tc>
+          <w:tcPr>
+            <w:tcW w:type="dxa" w:w="2493"/>
+            <w:vAlign w:val="center"/>
+            <w:tcMar>
+              <w:top w:w="100" w:type="dxa"/>
+              <w:start w:w="120" w:type="dxa"/>
+              <w:bottom w:w="100" w:type="dxa"/>
+              <w:end w:w="120" w:type="dxa"/>
+            </w:tcMar>
+          </w:tcPr>
+          <w:p>
+            <w:pPr>
+              <w:spacing w:after="0" w:before="0"/>
+            </w:pPr>
+            <w:r>
+              <w:rPr>
+                <w:sz w:val="19"/>
+              </w:rPr>
+              <w:t>읽기 전용 로컬 색인: 33,021조각 중 빈 지역 9,522. 생성 코드 이력·원본 DB는 미확인. 운영 보정은 별도.</w:t>
+            </w:r>
+          </w:p>
+        </w:tc>
+      </w:tr>
+      <w:tr>
+        <w:trPr>
+          <w:cantSplit/>
+        </w:trPr>
+        <w:tc>
+          <w:tcPr>
+            <w:tcW w:type="dxa" w:w="2493"/>
+            <w:vAlign w:val="center"/>
+            <w:tcMar>
+              <w:top w:w="100" w:type="dxa"/>
+              <w:start w:w="120" w:type="dxa"/>
+              <w:bottom w:w="100" w:type="dxa"/>
+              <w:end w:w="120" w:type="dxa"/>
+            </w:tcMar>
+          </w:tcPr>
+          <w:p>
+            <w:pPr>
+              <w:spacing w:after="0" w:before="0"/>
+            </w:pPr>
+            <w:r>
+              <w:rPr>
+                <w:sz w:val="19"/>
+              </w:rPr>
+              <w:t>한국어 신청기한 (2026-10-22)</w:t>
+            </w:r>
+          </w:p>
+        </w:tc>
+        <w:tc>
+          <w:tcPr>
+            <w:tcW w:type="dxa" w:w="2493"/>
+            <w:vAlign w:val="center"/>
+            <w:tcMar>
+              <w:top w:w="100" w:type="dxa"/>
+              <w:start w:w="120" w:type="dxa"/>
+              <w:bottom w:w="100" w:type="dxa"/>
+              <w:end w:w="120" w:type="dxa"/>
+            </w:tcMar>
+          </w:tcPr>
+          <w:p>
+            <w:pPr>
+              <w:spacing w:after="0" w:before="0"/>
+            </w:pPr>
+            <w:r>
+              <w:rPr>
+                <w:sz w:val="19"/>
+              </w:rPr>
+              <w:t>전체 한국어 날짜가 종료일로 해석되지 않음.</w:t>
+            </w:r>
+          </w:p>
+        </w:tc>
+        <w:tc>
+          <w:tcPr>
+            <w:tcW w:type="dxa" w:w="2493"/>
+            <w:vAlign w:val="center"/>
+            <w:tcMar>
+              <w:top w:w="100" w:type="dxa"/>
+              <w:start w:w="120" w:type="dxa"/>
+              <w:bottom w:w="100" w:type="dxa"/>
+              <w:end w:w="120" w:type="dxa"/>
+            </w:tcMar>
+          </w:tcPr>
+          <w:p>
+            <w:pPr>
+              <w:spacing w:after="0" w:before="0"/>
+            </w:pPr>
+            <w:r>
+              <w:rPr>
+                <w:sz w:val="19"/>
+              </w:rPr>
+              <w:t>숫자/년월일 전체 날짜 및 ~ 범위만 엄격 해석. 원문 보존, 종료 당일 포함. 모호한 일정은 미상.</w:t>
+            </w:r>
+          </w:p>
+        </w:tc>
+        <w:tc>
+          <w:tcPr>
+            <w:tcW w:type="dxa" w:w="2493"/>
+            <w:vAlign w:val="center"/>
+            <w:tcMar>
+              <w:top w:w="100" w:type="dxa"/>
+              <w:start w:w="120" w:type="dxa"/>
+              <w:bottom w:w="100" w:type="dxa"/>
+              <w:end w:w="120" w:type="dxa"/>
+            </w:tcMar>
+          </w:tcPr>
+          <w:p>
+            <w:pPr>
+              <w:spacing w:after="0" w:before="0"/>
+            </w:pPr>
+            <w:r>
+              <w:rPr>
+                <w:sz w:val="19"/>
+              </w:rPr>
+              <w:t>고정일 테스트로 해시·상태·이벤트·양쪽 검색 확인. 모든 만료를 판정한다는 의미는 아님.</w:t>
+            </w:r>
+          </w:p>
+        </w:tc>
+      </w:tr>
+      <w:tr>
+        <w:trPr>
+          <w:cantSplit/>
+        </w:trPr>
+        <w:tc>
+          <w:tcPr>
+            <w:tcW w:type="dxa" w:w="2493"/>
+            <w:vAlign w:val="center"/>
+            <w:tcMar>
+              <w:top w:w="100" w:type="dxa"/>
+              <w:start w:w="120" w:type="dxa"/>
+              <w:bottom w:w="100" w:type="dxa"/>
+              <w:end w:w="120" w:type="dxa"/>
+            </w:tcMar>
+          </w:tcPr>
+          <w:p>
+            <w:pPr>
+              <w:spacing w:after="0" w:before="0"/>
+            </w:pPr>
+            <w:r>
+              <w:rPr>
+                <w:sz w:val="19"/>
+              </w:rPr>
+              <w:t>원본 구간·재개 (2026-10-22)</w:t>
+            </w:r>
+          </w:p>
+        </w:tc>
+        <w:tc>
+          <w:tcPr>
+            <w:tcW w:type="dxa" w:w="2493"/>
+            <w:vAlign w:val="center"/>
+            <w:tcMar>
+              <w:top w:w="100" w:type="dxa"/>
+              <w:start w:w="120" w:type="dxa"/>
+              <w:bottom w:w="100" w:type="dxa"/>
+              <w:end w:w="120" w:type="dxa"/>
+            </w:tcMar>
+          </w:tcPr>
+          <w:p>
+            <w:pPr>
+              <w:spacing w:after="0" w:before="0"/>
+            </w:pPr>
+            <w:r>
+              <w:rPr>
+                <w:sz w:val="19"/>
+              </w:rPr>
+              <w:t>앞부분만 재처리 가능. 중단 시 처리 위치·유보 상태를 확정하기 어려움.</w:t>
+            </w:r>
+          </w:p>
+        </w:tc>
+        <w:tc>
+          <w:tcPr>
+            <w:tcW w:type="dxa" w:w="2493"/>
+            <w:vAlign w:val="center"/>
+            <w:tcMar>
+              <w:top w:w="100" w:type="dxa"/>
+              <w:start w:w="120" w:type="dxa"/>
+              <w:bottom w:w="100" w:type="dxa"/>
+              <w:end w:w="120" w:type="dxa"/>
+            </w:tcMar>
+          </w:tcPr>
+          <w:p>
+            <w:pPr>
+              <w:spacing w:after="0" w:before="0"/>
+            </w:pPr>
+            <w:r>
+              <w:rPr>
+                <w:sz w:val="19"/>
+              </w:rPr>
+              <w:t>offset/limit과 DB UUID·원본 해시·정책·정제 코드·기준일에 묶인 커서. 서비스/pending/실행과 같은 트랜잭션.</w:t>
+            </w:r>
+          </w:p>
+        </w:tc>
+        <w:tc>
+          <w:tcPr>
+            <w:tcW w:type="dxa" w:w="2493"/>
+            <w:vAlign w:val="center"/>
+            <w:tcMar>
+              <w:top w:w="100" w:type="dxa"/>
+              <w:start w:w="120" w:type="dxa"/>
+              <w:bottom w:w="100" w:type="dxa"/>
+              <w:end w:w="120" w:type="dxa"/>
+            </w:tcMar>
+          </w:tcPr>
+          <w:p>
+            <w:pPr>
+              <w:spacing w:after="0" w:before="0"/>
+            </w:pPr>
+            <w:r>
+              <w:rPr>
+                <w:sz w:val="19"/>
+              </w:rPr>
+              <w:t>실패·출력 오류 후 재개, 유보 별도 보존. 과거 관측은 fresh/소실 근거가 아님. 실제 연령 코드 어댑터는 보류.</w:t>
             </w:r>
           </w:p>
         </w:tc>

</xml_diff>

<commit_message>
feat(ingest): register and acquire official decision documents A1
</commit_message>
<xml_diff>
--- a/docs/사전기획서.docx
+++ b/docs/사전기획서.docx
@@ -8717,6 +8717,200 @@
                 <w:sz w:val="19"/>
               </w:rPr>
               <w:t>실패·출력 오류 후 재개, 유보 별도 보존. 과거 관측은 fresh/소실 근거가 아님. 실제 연령 코드 어댑터는 보류.</w:t>
+            </w:r>
+          </w:p>
+        </w:tc>
+      </w:tr>
+      <w:tr>
+        <w:trPr>
+          <w:cantSplit/>
+        </w:trPr>
+        <w:tc>
+          <w:tcPr>
+            <w:tcW w:type="dxa" w:w="2493"/>
+            <w:vAlign w:val="center"/>
+            <w:tcMar>
+              <w:top w:w="100" w:type="dxa"/>
+              <w:start w:w="120" w:type="dxa"/>
+              <w:bottom w:w="100" w:type="dxa"/>
+              <w:end w:w="120" w:type="dxa"/>
+            </w:tcMar>
+          </w:tcPr>
+          <w:p>
+            <w:pPr>
+              <w:spacing w:after="0" w:before="0"/>
+            </w:pPr>
+            <w:r>
+              <w:rPr>
+                <w:sz w:val="19"/>
+              </w:rPr>
+              <w:t>공식 문서 A-1 (2026-10-23)</w:t>
+            </w:r>
+          </w:p>
+        </w:tc>
+        <w:tc>
+          <w:tcPr>
+            <w:tcW w:type="dxa" w:w="2493"/>
+            <w:vAlign w:val="center"/>
+            <w:tcMar>
+              <w:top w:w="100" w:type="dxa"/>
+              <w:start w:w="120" w:type="dxa"/>
+              <w:bottom w:w="100" w:type="dxa"/>
+              <w:end w:w="120" w:type="dxa"/>
+            </w:tcMar>
+          </w:tcPr>
+          <w:p>
+            <w:pPr>
+              <w:spacing w:after="0" w:before="0"/>
+            </w:pPr>
+            <w:r>
+              <w:rPr>
+                <w:sz w:val="19"/>
+              </w:rPr>
+              <w:t>API 요약만으로 세부 조건·예외의 적용 문서·버전·시행 근거를 보존하기 어려움.</w:t>
+            </w:r>
+          </w:p>
+        </w:tc>
+        <w:tc>
+          <w:tcPr>
+            <w:tcW w:type="dxa" w:w="2493"/>
+            <w:vAlign w:val="center"/>
+            <w:tcMar>
+              <w:top w:w="100" w:type="dxa"/>
+              <w:start w:w="120" w:type="dxa"/>
+              <w:bottom w:w="100" w:type="dxa"/>
+              <w:end w:w="120" w:type="dxa"/>
+            </w:tcMar>
+          </w:tcPr>
+          <w:p>
+            <w:pPr>
+              <w:spacing w:after="0" w:before="0"/>
+            </w:pPr>
+            <w:r>
+              <w:rPr>
+                <w:sz w:val="19"/>
+              </w:rPr>
+              <w:t>별도 카탈로그·원본·진단 경로. 논리 문서/바이트 버전/시도/주제별 제도 연결을 분리하고 공식 출처·효력·감사를 보존.</w:t>
+            </w:r>
+          </w:p>
+        </w:tc>
+        <w:tc>
+          <w:tcPr>
+            <w:tcW w:type="dxa" w:w="2493"/>
+            <w:vAlign w:val="center"/>
+            <w:tcMar>
+              <w:top w:w="100" w:type="dxa"/>
+              <w:start w:w="120" w:type="dxa"/>
+              <w:bottom w:w="100" w:type="dxa"/>
+              <w:end w:w="120" w:type="dxa"/>
+            </w:tcMar>
+          </w:tcPr>
+          <w:p>
+            <w:pPr>
+              <w:spacing w:after="0" w:before="0"/>
+            </w:pPr>
+            <w:r>
+              <w:rPr>
+                <w:sz w:val="19"/>
+              </w:rPr>
+              <w:t>공식 PDF 3종 확보, 중복 재수집은 버전 재사용. 국토부 고시 첨부의 실패와 공식 재게시 출처를 구분. 날짜·개정 영향·사람 검수 미해결은 명시.</w:t>
+            </w:r>
+          </w:p>
+        </w:tc>
+      </w:tr>
+      <w:tr>
+        <w:trPr>
+          <w:cantSplit/>
+        </w:trPr>
+        <w:tc>
+          <w:tcPr>
+            <w:tcW w:type="dxa" w:w="2493"/>
+            <w:vAlign w:val="center"/>
+            <w:tcMar>
+              <w:top w:w="100" w:type="dxa"/>
+              <w:start w:w="120" w:type="dxa"/>
+              <w:bottom w:w="100" w:type="dxa"/>
+              <w:end w:w="120" w:type="dxa"/>
+            </w:tcMar>
+          </w:tcPr>
+          <w:p>
+            <w:pPr>
+              <w:spacing w:after="0" w:before="0"/>
+            </w:pPr>
+            <w:r>
+              <w:rPr>
+                <w:sz w:val="19"/>
+              </w:rPr>
+              <w:t>문서 근거 B/C 확장 협의안</w:t>
+            </w:r>
+          </w:p>
+        </w:tc>
+        <w:tc>
+          <w:tcPr>
+            <w:tcW w:type="dxa" w:w="2493"/>
+            <w:vAlign w:val="center"/>
+            <w:tcMar>
+              <w:top w:w="100" w:type="dxa"/>
+              <w:start w:w="120" w:type="dxa"/>
+              <w:bottom w:w="100" w:type="dxa"/>
+              <w:end w:w="120" w:type="dxa"/>
+            </w:tcMar>
+          </w:tcPr>
+          <w:p>
+            <w:pPr>
+              <w:spacing w:after="0" w:before="0"/>
+            </w:pPr>
+            <w:r>
+              <w:rPr>
+                <w:sz w:val="19"/>
+              </w:rPr>
+              <w:t>서비스 전체 교체에 문서 조각만 전달하면 API 근거를 삭제할 위험.</w:t>
+            </w:r>
+          </w:p>
+        </w:tc>
+        <w:tc>
+          <w:tcPr>
+            <w:tcW w:type="dxa" w:w="2493"/>
+            <w:vAlign w:val="center"/>
+            <w:tcMar>
+              <w:top w:w="100" w:type="dxa"/>
+              <w:start w:w="120" w:type="dxa"/>
+              <w:bottom w:w="100" w:type="dxa"/>
+              <w:end w:w="120" w:type="dxa"/>
+            </w:tcMar>
+          </w:tcPr>
+          <w:p>
+            <w:pPr>
+              <w:spacing w:after="0" w:before="0"/>
+            </w:pPr>
+            <w:r>
+              <w:rPr>
+                <w:sz w:val="19"/>
+              </w:rPr>
+              <w:t>별도 문서 컬렉션·버전별 교체·문서 큐/정확 확인·문서/버전/위치 인용을 제안. 물리 페이지와 인쇄 쪽을 구분.</w:t>
+            </w:r>
+          </w:p>
+        </w:tc>
+        <w:tc>
+          <w:tcPr>
+            <w:tcW w:type="dxa" w:w="2493"/>
+            <w:vAlign w:val="center"/>
+            <w:tcMar>
+              <w:top w:w="100" w:type="dxa"/>
+              <w:start w:w="120" w:type="dxa"/>
+              <w:bottom w:w="100" w:type="dxa"/>
+              <w:end w:w="120" w:type="dxa"/>
+            </w:tcMar>
+          </w:tcPr>
+          <w:p>
+            <w:pPr>
+              <w:spacing w:after="0" w:before="0"/>
+            </w:pPr>
+            <w:r>
+              <w:rPr>
+                <w:sz w:val="19"/>
+              </w:rPr>
+              <w:t>A-1은 등록·원본·메타데이터·연결까지만 구현. A-2 추출/상세조건 평가, A-3 검색·인용은 추후 합의. 개별 수급 판정·지급 계산·검색 AI 우위 검증은 하지 않음.</w:t>
             </w:r>
           </w:p>
         </w:tc>

</xml_diff>

<commit_message>
feat: filter benefit details by selected category
</commit_message>
<xml_diff>
--- a/docs/사전기획서.docx
+++ b/docs/사전기획서.docx
@@ -8911,6 +8911,88 @@
                 <w:sz w:val="19"/>
               </w:rPr>
               <w:t>A-1은 등록·원본·메타데이터·연결까지만 구현. A-2 추출/상세조건 평가, A-3 검색·인용은 추후 합의. 개별 수급 판정·지급 계산·검색 AI 우위 검증은 하지 않음.</w:t>
+            </w:r>
+          </w:p>
+        </w:tc>
+      </w:tr>
+      <w:tr>
+        <w:trPr>
+          <w:cantSplit w:val="0"/>
+          <w:tblHeader w:val="0"/>
+        </w:trPr>
+        <w:tc>
+          <w:tcPr>
+            <w:tcMar>
+              <w:top w:w="100.0" w:type="dxa"/>
+              <w:bottom w:w="100.0" w:type="dxa"/>
+            </w:tcMar>
+            <w:vAlign w:val="center"/>
+          </w:tcPr>
+          <w:p>
+            <w:pPr>
+              <w:spacing w:after="0" w:before="0" w:lineRule="auto"/>
+              <w:rPr/>
+            </w:pPr>
+            <w:r>
+              <w:rPr/>
+              <w:t>W5 유형별 안내 (2026-10-29)</w:t>
+            </w:r>
+          </w:p>
+        </w:tc>
+        <w:tc>
+          <w:tcPr>
+            <w:tcMar>
+              <w:top w:w="100.0" w:type="dxa"/>
+              <w:bottom w:w="100.0" w:type="dxa"/>
+            </w:tcMar>
+            <w:vAlign w:val="center"/>
+          </w:tcPr>
+          <w:p>
+            <w:pPr>
+              <w:spacing w:after="0" w:before="0" w:lineRule="auto"/>
+              <w:rPr/>
+            </w:pPr>
+            <w:r>
+              <w:rPr/>
+              <w:t>다른 가구 유형이 추가 조건·금액·직접 구성 우회로 노출</w:t>
+            </w:r>
+          </w:p>
+        </w:tc>
+        <w:tc>
+          <w:tcPr>
+            <w:tcMar>
+              <w:top w:w="100.0" w:type="dxa"/>
+              <w:bottom w:w="100.0" w:type="dxa"/>
+            </w:tcMar>
+            <w:vAlign w:val="center"/>
+          </w:tcPr>
+          <w:p>
+            <w:pPr>
+              <w:spacing w:after="0" w:before="0" w:lineRule="auto"/>
+              <w:rPr/>
+            </w:pPr>
+            <w:r>
+              <w:rPr/>
+              <w:t>고정 유형·조건 ID와 common/options/unresolved 검증. 선택·공통만 판정하고 설정·선택·확인·입력 지문으로 재확인. 원문 유지.</w:t>
+            </w:r>
+          </w:p>
+        </w:tc>
+        <w:tc>
+          <w:tcPr>
+            <w:tcMar>
+              <w:top w:w="100.0" w:type="dxa"/>
+              <w:bottom w:w="100.0" w:type="dxa"/>
+            </w:tcMar>
+            <w:vAlign w:val="center"/>
+          </w:tcPr>
+          <w:p>
+            <w:pPr>
+              <w:spacing w:after="0" w:before="0" w:lineRule="auto"/>
+              <w:rPr/>
+            </w:pPr>
+            <w:r>
+              <w:rPr/>
+              <w:t>105100000001 원문 행을 읽기 전용 연결. 합성·로컬 원문 AppTest 확인. 새 금액·산식·사람 승인 없음. 실제 브라우저 검증 별도.</w:t>
             </w:r>
           </w:p>
         </w:tc>

</xml_diff>

<commit_message>
Revert "Merge pull request #56 from KU-CS-HTG/feat/w5-category-benefits"
This reverts commit 288efbcaf4824e518b398ca4bfa3a6ed81bb42a3, reversing
changes made to bfeb600154adf23c5f687bf198eb4e97f4c43e5b.
</commit_message>
<xml_diff>
--- a/docs/사전기획서.docx
+++ b/docs/사전기획서.docx
@@ -8911,88 +8911,6 @@
                 <w:sz w:val="19"/>
               </w:rPr>
               <w:t>A-1은 등록·원본·메타데이터·연결까지만 구현. A-2 추출/상세조건 평가, A-3 검색·인용은 추후 합의. 개별 수급 판정·지급 계산·검색 AI 우위 검증은 하지 않음.</w:t>
-            </w:r>
-          </w:p>
-        </w:tc>
-      </w:tr>
-      <w:tr>
-        <w:trPr>
-          <w:cantSplit w:val="0"/>
-          <w:tblHeader w:val="0"/>
-        </w:trPr>
-        <w:tc>
-          <w:tcPr>
-            <w:tcMar>
-              <w:top w:w="100.0" w:type="dxa"/>
-              <w:bottom w:w="100.0" w:type="dxa"/>
-            </w:tcMar>
-            <w:vAlign w:val="center"/>
-          </w:tcPr>
-          <w:p>
-            <w:pPr>
-              <w:spacing w:after="0" w:before="0" w:lineRule="auto"/>
-              <w:rPr/>
-            </w:pPr>
-            <w:r>
-              <w:rPr/>
-              <w:t>W5 유형별 안내 (2026-10-29)</w:t>
-            </w:r>
-          </w:p>
-        </w:tc>
-        <w:tc>
-          <w:tcPr>
-            <w:tcMar>
-              <w:top w:w="100.0" w:type="dxa"/>
-              <w:bottom w:w="100.0" w:type="dxa"/>
-            </w:tcMar>
-            <w:vAlign w:val="center"/>
-          </w:tcPr>
-          <w:p>
-            <w:pPr>
-              <w:spacing w:after="0" w:before="0" w:lineRule="auto"/>
-              <w:rPr/>
-            </w:pPr>
-            <w:r>
-              <w:rPr/>
-              <w:t>다른 가구 유형이 추가 조건·금액·직접 구성 우회로 노출</w:t>
-            </w:r>
-          </w:p>
-        </w:tc>
-        <w:tc>
-          <w:tcPr>
-            <w:tcMar>
-              <w:top w:w="100.0" w:type="dxa"/>
-              <w:bottom w:w="100.0" w:type="dxa"/>
-            </w:tcMar>
-            <w:vAlign w:val="center"/>
-          </w:tcPr>
-          <w:p>
-            <w:pPr>
-              <w:spacing w:after="0" w:before="0" w:lineRule="auto"/>
-              <w:rPr/>
-            </w:pPr>
-            <w:r>
-              <w:rPr/>
-              <w:t>고정 유형·조건 ID와 common/options/unresolved 검증. 선택·공통만 판정하고 설정·선택·확인·입력 지문으로 재확인. 원문 유지.</w:t>
-            </w:r>
-          </w:p>
-        </w:tc>
-        <w:tc>
-          <w:tcPr>
-            <w:tcMar>
-              <w:top w:w="100.0" w:type="dxa"/>
-              <w:bottom w:w="100.0" w:type="dxa"/>
-            </w:tcMar>
-            <w:vAlign w:val="center"/>
-          </w:tcPr>
-          <w:p>
-            <w:pPr>
-              <w:spacing w:after="0" w:before="0" w:lineRule="auto"/>
-              <w:rPr/>
-            </w:pPr>
-            <w:r>
-              <w:rPr/>
-              <w:t>105100000001 원문 행을 읽기 전용 연결. 합성·로컬 원문 AppTest 확인. 새 금액·산식·사람 승인 없음. 실제 브라우저 검증 별도.</w:t>
             </w:r>
           </w:p>
         </w:tc>

</xml_diff>